<commit_message>
1. Changed Keycloak port 2. Updated docs
</commit_message>
<xml_diff>
--- a/Docs/How to Configure Keycloak to Setup SAML Single Sign On.docx
+++ b/Docs/How to Configure Keycloak to Setup SAML Single Sign On.docx
@@ -59,6 +59,38 @@
           <w:rFonts w:ascii="Times New Roman" w:hAnsi="Times New Roman" w:cs="Times New Roman"/>
         </w:rPr>
       </w:pPr>
+      <w:r>
+        <w:rPr>
+          <w:rFonts w:ascii="Times New Roman" w:hAnsi="Times New Roman" w:cs="Times New Roman"/>
+        </w:rPr>
+        <w:t xml:space="preserve">Suppose </w:t>
+      </w:r>
+      <w:proofErr w:type="spellStart"/>
+      <w:r>
+        <w:rPr>
+          <w:rFonts w:ascii="Times New Roman" w:hAnsi="Times New Roman" w:cs="Times New Roman"/>
+        </w:rPr>
+        <w:t>Keycloak</w:t>
+      </w:r>
+      <w:proofErr w:type="spellEnd"/>
+      <w:r>
+        <w:rPr>
+          <w:rFonts w:ascii="Times New Roman" w:hAnsi="Times New Roman" w:cs="Times New Roman"/>
+        </w:rPr>
+        <w:t xml:space="preserve"> server starts at localhost:999</w:t>
+      </w:r>
+      <w:r>
+        <w:rPr>
+          <w:rFonts w:ascii="Times New Roman" w:hAnsi="Times New Roman" w:cs="Times New Roman"/>
+        </w:rPr>
+        <w:t>1</w:t>
+      </w:r>
+      <w:r>
+        <w:rPr>
+          <w:rFonts w:ascii="Times New Roman" w:hAnsi="Times New Roman" w:cs="Times New Roman"/>
+        </w:rPr>
+        <w:t xml:space="preserve">. </w:t>
+      </w:r>
       <w:r>
         <w:rPr>
           <w:rFonts w:ascii="Times New Roman" w:hAnsi="Times New Roman" w:cs="Times New Roman"/>
@@ -2561,15 +2593,14 @@
             <w:hyperlink r:id="rId26" w:history="1">
               <w:r>
                 <w:rPr>
+                  <w:rStyle w:val="Hyperlink"/>
                   <w:rFonts w:ascii="Carlito" w:eastAsia="Times New Roman" w:hAnsi="Carlito" w:cs="Times New Roman"/>
-                  <w:color w:val="467886"/>
                   <w:kern w:val="0"/>
                   <w:sz w:val="22"/>
                   <w:szCs w:val="22"/>
-                  <w:u w:val="single"/>
                   <w14:ligatures w14:val="none"/>
                 </w:rPr>
-                <w:t>http://localhost:8081/realms/MySecurityRealm/protocol/saml</w:t>
+                <w:t>http://localhost:9991/realms/MySecurityRealm/protocol/saml</w:t>
               </w:r>
             </w:hyperlink>
           </w:p>
@@ -2985,15 +3016,14 @@
             <w:hyperlink r:id="rId27" w:history="1">
               <w:r>
                 <w:rPr>
+                  <w:rStyle w:val="Hyperlink"/>
                   <w:rFonts w:ascii="Carlito" w:eastAsia="Times New Roman" w:hAnsi="Carlito" w:cs="Times New Roman"/>
-                  <w:color w:val="467886"/>
                   <w:kern w:val="0"/>
                   <w:sz w:val="22"/>
                   <w:szCs w:val="22"/>
-                  <w:u w:val="single"/>
                   <w14:ligatures w14:val="none"/>
                 </w:rPr>
-                <w:t>http://localhost:8081/realms/MySecurityRealm/protocol/saml/descriptor</w:t>
+                <w:t>http://localhost:9991/realms/MySecurityRealm/protocol/saml/descriptor</w:t>
               </w:r>
             </w:hyperlink>
           </w:p>

</xml_diff>